<commit_message>
Readiness tool: domains now AI Governance, AI Risk & Security, Training & Awareness, Strategy & Value, Data & Technology
- Protect AI + AI Threats + AI risk-management questions combined into AI Risk & Security
- Questions regrouped by domain; sample responses, questionnaire and sample report regenerated
- Report: chart spacing, page numbers start at 1, headers kept with their rows

Co-Authored-By: Claude Opus 5.5 <noreply@anthropic.com>
Claude-Session: https://claude.ai/code/session_01X8ossW6xvKTGEs2GV44CxS
</commit_message>
<xml_diff>
--- a/01_AI_Governance_Risk_Compliance/1.3_AI_Readiness_Assessment_Tool/client_questionnaire/GT_AI_Readiness_Questionnaire.docx
+++ b/01_AI_Governance_Risk_Compliance/1.3_AI_Readiness_Assessment_Tool/client_questionnaire/GT_AI_Readiness_Questionnaire.docx
@@ -950,6 +950,855 @@
         <w:pStyle w:val="Heading2"/>
       </w:pPr>
       <w:r>
+        <w:t>AI Governance</w:t>
+      </w:r>
+    </w:p>
+    <w:p>
+      <w:pPr>
+        <w:keepNext/>
+        <w:spacing w:before="160"/>
+      </w:pPr>
+      <w:r>
+        <w:rPr>
+          <w:b/>
+        </w:rPr>
+        <w:t>19. [Q5] Is there a defined AI governance structure - board / executive oversight, an AI committee with decision rights, named owners for every AI system and clear three-lines-of-defence responsibilities?</w:t>
+      </w:r>
+    </w:p>
+    <w:p>
+      <w:pPr>
+        <w:keepNext/>
+      </w:pPr>
+      <w:r>
+        <w:rPr>
+          <w:i/>
+          <w:color w:val="6B6B6B"/>
+          <w:sz w:val="18"/>
+        </w:rPr>
+        <w:t>Examples of evidence: board / ExCo terms of reference covering AI, AI committee charter, RACI, AI system owner register, internal-audit coverage.</w:t>
+      </w:r>
+    </w:p>
+    <w:p>
+      <w:pPr>
+        <w:keepNext/>
+        <w:spacing w:after="20"/>
+        <w:ind w:left="454"/>
+      </w:pPr>
+      <w:r>
+        <w:t>A. No defined AI governance; decisions are made ad hoc by individual teams</w:t>
+      </w:r>
+    </w:p>
+    <w:p>
+      <w:pPr>
+        <w:keepNext/>
+        <w:spacing w:after="20"/>
+        <w:ind w:left="454"/>
+      </w:pPr>
+      <w:r>
+        <w:t>B. Informal oversight by IT or a single function; roles not documented</w:t>
+      </w:r>
+    </w:p>
+    <w:p>
+      <w:pPr>
+        <w:keepNext/>
+        <w:spacing w:after="20"/>
+        <w:ind w:left="454"/>
+      </w:pPr>
+      <w:r>
+        <w:t>C. AI committee or sponsor defined on paper; roles and decision rights partly documented</w:t>
+      </w:r>
+    </w:p>
+    <w:p>
+      <w:pPr>
+        <w:keepNext/>
+        <w:spacing w:after="20"/>
+        <w:ind w:left="454"/>
+      </w:pPr>
+      <w:r>
+        <w:t>D. Board / ExCo oversight, AI committee with charter and decision rights, named system owners and a documented RACI across the three lines</w:t>
+      </w:r>
+    </w:p>
+    <w:p>
+      <w:pPr>
+        <w:keepNext w:val="0"/>
+        <w:spacing w:after="20"/>
+        <w:ind w:left="454"/>
+      </w:pPr>
+      <w:r>
+        <w:t>E. Governance operates effectively: regular board reporting, periodic effectiveness review and independent assurance by internal audit</w:t>
+      </w:r>
+    </w:p>
+    <w:p>
+      <w:pPr>
+        <w:keepNext/>
+        <w:spacing w:before="160"/>
+      </w:pPr>
+      <w:r>
+        <w:rPr>
+          <w:b/>
+        </w:rPr>
+        <w:t>20. [Q6] Do you have an approved AI (acceptable-use) policy and a process to identify and comply with applicable AI-related regulation (e.g., Bahrain PDPL, CBB rules, EU AI Act)?</w:t>
+      </w:r>
+    </w:p>
+    <w:p>
+      <w:pPr>
+        <w:keepNext/>
+      </w:pPr>
+      <w:r>
+        <w:rPr>
+          <w:i/>
+          <w:color w:val="6B6B6B"/>
+          <w:sz w:val="18"/>
+        </w:rPr>
+        <w:t>Examples of evidence: AI policy, approved-tools list, staff acknowledgements, obligations register, compliance reviews.</w:t>
+      </w:r>
+    </w:p>
+    <w:p>
+      <w:pPr>
+        <w:keepNext/>
+        <w:spacing w:after="20"/>
+        <w:ind w:left="454"/>
+      </w:pPr>
+      <w:r>
+        <w:t>A. No AI policy; applicable AI regulations have not been identified</w:t>
+      </w:r>
+    </w:p>
+    <w:p>
+      <w:pPr>
+        <w:keepNext/>
+        <w:spacing w:after="20"/>
+        <w:ind w:left="454"/>
+      </w:pPr>
+      <w:r>
+        <w:t>B. Informal guidance only (e.g., emails); obligations understood by a few individuals</w:t>
+      </w:r>
+    </w:p>
+    <w:p>
+      <w:pPr>
+        <w:keepNext/>
+        <w:spacing w:after="20"/>
+        <w:ind w:left="454"/>
+      </w:pPr>
+      <w:r>
+        <w:t>C. AI acceptable-use policy approved; regulatory obligations identified but not mapped to controls</w:t>
+      </w:r>
+    </w:p>
+    <w:p>
+      <w:pPr>
+        <w:keepNext/>
+        <w:spacing w:after="20"/>
+        <w:ind w:left="454"/>
+      </w:pPr>
+      <w:r>
+        <w:t>D. AI policy enforced with staff acknowledgement; obligations register maps regulations to controls and owners</w:t>
+      </w:r>
+    </w:p>
+    <w:p>
+      <w:pPr>
+        <w:keepNext w:val="0"/>
+        <w:spacing w:after="20"/>
+        <w:ind w:left="454"/>
+      </w:pPr>
+      <w:r>
+        <w:t>E. Policy and obligations register reviewed regularly with horizon scanning; compliance tested and audit-ready evidence maintained</w:t>
+      </w:r>
+    </w:p>
+    <w:p>
+      <w:pPr>
+        <w:keepNext/>
+        <w:spacing w:before="160"/>
+      </w:pPr>
+      <w:r>
+        <w:rPr>
+          <w:b/>
+        </w:rPr>
+        <w:t>21. [Q7] Are there practical guardrails for fairness, transparency and human oversight, overseen by an AI committee or centre of excellence?</w:t>
+      </w:r>
+    </w:p>
+    <w:p>
+      <w:pPr>
+        <w:keepNext/>
+      </w:pPr>
+      <w:r>
+        <w:rPr>
+          <w:i/>
+          <w:color w:val="6B6B6B"/>
+          <w:sz w:val="18"/>
+        </w:rPr>
+        <w:t>Examples of evidence: committee / CoE charter, guardrail standards, human-in-charge procedures, bias tests, AI disclosures, appeal routes.</w:t>
+      </w:r>
+    </w:p>
+    <w:p>
+      <w:pPr>
+        <w:keepNext/>
+        <w:spacing w:after="20"/>
+        <w:ind w:left="454"/>
+      </w:pPr>
+      <w:r>
+        <w:t>A. No responsible-AI guardrails or oversight body</w:t>
+      </w:r>
+    </w:p>
+    <w:p>
+      <w:pPr>
+        <w:keepNext/>
+        <w:spacing w:after="20"/>
+        <w:ind w:left="454"/>
+      </w:pPr>
+      <w:r>
+        <w:t>B. High-level ethical principles published but not operationalised</w:t>
+      </w:r>
+    </w:p>
+    <w:p>
+      <w:pPr>
+        <w:keepNext/>
+        <w:spacing w:after="20"/>
+        <w:ind w:left="454"/>
+      </w:pPr>
+      <w:r>
+        <w:t>C. AI committee / CoE established; guardrails defined for some areas (e.g., human review of outputs)</w:t>
+      </w:r>
+    </w:p>
+    <w:p>
+      <w:pPr>
+        <w:keepNext/>
+        <w:spacing w:after="20"/>
+        <w:ind w:left="454"/>
+      </w:pPr>
+      <w:r>
+        <w:t>D. Guardrails for fairness, transparency, disclosure and human-in-charge controls applied to all relevant AI; committee approves high-risk uses</w:t>
+      </w:r>
+    </w:p>
+    <w:p>
+      <w:pPr>
+        <w:keepNext w:val="0"/>
+        <w:spacing w:after="20"/>
+        <w:ind w:left="454"/>
+      </w:pPr>
+      <w:r>
+        <w:t>E. Guardrails tested (bias testing, oversight effectiveness); contestability routes for affected persons; lessons fed back into standards</w:t>
+      </w:r>
+    </w:p>
+    <w:p>
+      <w:pPr>
+        <w:keepNext/>
+        <w:spacing w:before="160"/>
+      </w:pPr>
+      <w:r>
+        <w:rPr>
+          <w:b/>
+        </w:rPr>
+        <w:t>22. [Q8] Are AI incidents detected, managed and reported, and is AI governance subject to internal audit or independent assurance?</w:t>
+      </w:r>
+    </w:p>
+    <w:p>
+      <w:pPr>
+        <w:keepNext/>
+      </w:pPr>
+      <w:r>
+        <w:rPr>
+          <w:i/>
+          <w:color w:val="6B6B6B"/>
+          <w:sz w:val="18"/>
+        </w:rPr>
+        <w:t>Examples of evidence: AI incident categories, notification criteria, incident logs, internal-audit reports, vendor assurance, certification status.</w:t>
+      </w:r>
+    </w:p>
+    <w:p>
+      <w:pPr>
+        <w:keepNext/>
+        <w:spacing w:after="20"/>
+        <w:ind w:left="454"/>
+      </w:pPr>
+      <w:r>
+        <w:t>A. No AI incident process or assurance</w:t>
+      </w:r>
+    </w:p>
+    <w:p>
+      <w:pPr>
+        <w:keepNext/>
+        <w:spacing w:after="20"/>
+        <w:ind w:left="454"/>
+      </w:pPr>
+      <w:r>
+        <w:t>B. AI issues handled through general IT incident processes; no AI-specific assurance</w:t>
+      </w:r>
+    </w:p>
+    <w:p>
+      <w:pPr>
+        <w:keepNext/>
+        <w:spacing w:after="20"/>
+        <w:ind w:left="454"/>
+      </w:pPr>
+      <w:r>
+        <w:t>C. AI incident categories and escalation defined; ad hoc reviews of AI controls</w:t>
+      </w:r>
+    </w:p>
+    <w:p>
+      <w:pPr>
+        <w:keepNext/>
+        <w:spacing w:after="20"/>
+        <w:ind w:left="454"/>
+      </w:pPr>
+      <w:r>
+        <w:t>D. AI incident management with regulatory notification criteria; periodic internal audit of AI governance; assurance obtained from AI vendors</w:t>
+      </w:r>
+    </w:p>
+    <w:p>
+      <w:pPr>
+        <w:keepNext w:val="0"/>
+        <w:spacing w:after="20"/>
+        <w:ind w:left="454"/>
+      </w:pPr>
+      <w:r>
+        <w:t>E. Post-incident learning drives improvement; AI management system certified or certification-ready (ISO/IEC 42001); assurance reported to the board</w:t>
+      </w:r>
+    </w:p>
+    <w:p>
+      <w:pPr>
+        <w:pStyle w:val="Heading2"/>
+      </w:pPr>
+      <w:r>
+        <w:t>AI Risk &amp; Security</w:t>
+      </w:r>
+    </w:p>
+    <w:p>
+      <w:pPr>
+        <w:keepNext/>
+        <w:spacing w:before="160"/>
+      </w:pPr>
+      <w:r>
+        <w:rPr>
+          <w:b/>
+        </w:rPr>
+        <w:t>23. [Q9] Is there a documented AI risk management framework - risk taxonomy, assessment method, scoring scales and treatment process - integrated with enterprise risk management?</w:t>
+      </w:r>
+    </w:p>
+    <w:p>
+      <w:pPr>
+        <w:keepNext/>
+      </w:pPr>
+      <w:r>
+        <w:rPr>
+          <w:i/>
+          <w:color w:val="6B6B6B"/>
+          <w:sz w:val="18"/>
+        </w:rPr>
+        <w:t>Examples of evidence: AI risk framework / methodology (e.g., aligned to ISO/IEC 23894 or NIST AI RMF), AI risk register, link to the enterprise risk register, completed assessments.</w:t>
+      </w:r>
+    </w:p>
+    <w:p>
+      <w:pPr>
+        <w:keepNext/>
+        <w:spacing w:after="20"/>
+        <w:ind w:left="454"/>
+      </w:pPr>
+      <w:r>
+        <w:t>A. AI risks are not identified or managed</w:t>
+      </w:r>
+    </w:p>
+    <w:p>
+      <w:pPr>
+        <w:keepNext/>
+        <w:spacing w:after="20"/>
+        <w:ind w:left="454"/>
+      </w:pPr>
+      <w:r>
+        <w:t>B. AI risks considered informally within general IT or project risk</w:t>
+      </w:r>
+    </w:p>
+    <w:p>
+      <w:pPr>
+        <w:keepNext/>
+        <w:spacing w:after="20"/>
+        <w:ind w:left="454"/>
+      </w:pPr>
+      <w:r>
+        <w:t>C. AI risk methodology drafted (taxonomy, scales) and applied to some AI initiatives</w:t>
+      </w:r>
+    </w:p>
+    <w:p>
+      <w:pPr>
+        <w:keepNext/>
+        <w:spacing w:after="20"/>
+        <w:ind w:left="454"/>
+      </w:pPr>
+      <w:r>
+        <w:t>D. Approved AI risk framework aligned to ISO/IEC 23894 / NIST AI RMF, applied to all AI use cases and integrated with the enterprise risk register</w:t>
+      </w:r>
+    </w:p>
+    <w:p>
+      <w:pPr>
+        <w:keepNext w:val="0"/>
+        <w:spacing w:after="20"/>
+        <w:ind w:left="454"/>
+      </w:pPr>
+      <w:r>
+        <w:t>E. Framework reviewed annually; AI risk aggregated across the portfolio and used in decisions; treatment effectiveness tested</w:t>
+      </w:r>
+    </w:p>
+    <w:p>
+      <w:pPr>
+        <w:keepNext/>
+        <w:spacing w:before="160"/>
+      </w:pPr>
+      <w:r>
+        <w:rPr>
+          <w:b/>
+        </w:rPr>
+        <w:t>24. [Q10] Has the board approved an AI risk appetite with measurable tolerances, and are key risk indicators (KRIs) monitored and reported with defined escalation?</w:t>
+      </w:r>
+    </w:p>
+    <w:p>
+      <w:pPr>
+        <w:keepNext/>
+      </w:pPr>
+      <w:r>
+        <w:rPr>
+          <w:i/>
+          <w:color w:val="6B6B6B"/>
+          <w:sz w:val="18"/>
+        </w:rPr>
+        <w:t>Examples of evidence: approved AI risk appetite statement, KRI library with thresholds, risk dashboards, escalation and breach records.</w:t>
+      </w:r>
+    </w:p>
+    <w:p>
+      <w:pPr>
+        <w:keepNext/>
+        <w:spacing w:after="20"/>
+        <w:ind w:left="454"/>
+      </w:pPr>
+      <w:r>
+        <w:t>A. No AI risk appetite or risk indicators</w:t>
+      </w:r>
+    </w:p>
+    <w:p>
+      <w:pPr>
+        <w:keepNext/>
+        <w:spacing w:after="20"/>
+        <w:ind w:left="454"/>
+      </w:pPr>
+      <w:r>
+        <w:t>B. Enterprise risk appetite exists but does not address AI</w:t>
+      </w:r>
+    </w:p>
+    <w:p>
+      <w:pPr>
+        <w:keepNext/>
+        <w:spacing w:after="20"/>
+        <w:ind w:left="454"/>
+      </w:pPr>
+      <w:r>
+        <w:t>C. AI risk appetite drafted; a few indicators tracked informally</w:t>
+      </w:r>
+    </w:p>
+    <w:p>
+      <w:pPr>
+        <w:keepNext/>
+        <w:spacing w:after="20"/>
+        <w:ind w:left="454"/>
+      </w:pPr>
+      <w:r>
+        <w:t>D. Board-approved AI risk appetite with tolerances; KRIs with thresholds monitored and reported at least quarterly</w:t>
+      </w:r>
+    </w:p>
+    <w:p>
+      <w:pPr>
+        <w:keepNext w:val="0"/>
+        <w:spacing w:after="20"/>
+        <w:ind w:left="454"/>
+      </w:pPr>
+      <w:r>
+        <w:t>E. KRIs automated with mandatory responses on breach; appetite reviewed annually and used to steer investment and approvals</w:t>
+      </w:r>
+    </w:p>
+    <w:p>
+      <w:pPr>
+        <w:keepNext/>
+        <w:spacing w:before="160"/>
+      </w:pPr>
+      <w:r>
+        <w:rPr>
+          <w:b/>
+        </w:rPr>
+        <w:t>25. [Q11] Do you maintain an inventory of AI systems with named owners, and assess AI risks and impacts (including third-party AI) before and after deployment?</w:t>
+      </w:r>
+    </w:p>
+    <w:p>
+      <w:pPr>
+        <w:keepNext/>
+      </w:pPr>
+      <w:r>
+        <w:rPr>
+          <w:i/>
+          <w:color w:val="6B6B6B"/>
+          <w:sz w:val="18"/>
+        </w:rPr>
+        <w:t>Examples of evidence: AI register, risk-tiering records, impact assessments, vendor AI due diligence, re-assessment records.</w:t>
+      </w:r>
+    </w:p>
+    <w:p>
+      <w:pPr>
+        <w:keepNext/>
+        <w:spacing w:after="20"/>
+        <w:ind w:left="454"/>
+      </w:pPr>
+      <w:r>
+        <w:t>A. No inventory; AI risks are not assessed</w:t>
+      </w:r>
+    </w:p>
+    <w:p>
+      <w:pPr>
+        <w:keepNext/>
+        <w:spacing w:after="20"/>
+        <w:ind w:left="454"/>
+      </w:pPr>
+      <w:r>
+        <w:t>B. Partial list of AI tools; risks assessed occasionally through general IT or vendor processes</w:t>
+      </w:r>
+    </w:p>
+    <w:p>
+      <w:pPr>
+        <w:keepNext/>
+        <w:spacing w:after="20"/>
+        <w:ind w:left="454"/>
+      </w:pPr>
+      <w:r>
+        <w:t>C. AI register with owners; risk assessments performed for some AI systems using a documented method</w:t>
+      </w:r>
+    </w:p>
+    <w:p>
+      <w:pPr>
+        <w:keepNext/>
+        <w:spacing w:after="20"/>
+        <w:ind w:left="454"/>
+      </w:pPr>
+      <w:r>
+        <w:t>D. Complete AI register; all AI use cases risk-tiered and assessed (incl. third-party AI) with approvals proportionate to risk</w:t>
+      </w:r>
+    </w:p>
+    <w:p>
+      <w:pPr>
+        <w:keepNext w:val="0"/>
+        <w:spacing w:after="20"/>
+        <w:ind w:left="454"/>
+      </w:pPr>
+      <w:r>
+        <w:t>E. Register reconciled quarterly; impact assessments (ISO/IEC 42005 / FRIA) for high-risk uses; re-assessment on change with KRIs monitored</w:t>
+      </w:r>
+    </w:p>
+    <w:p>
+      <w:pPr>
+        <w:keepNext/>
+        <w:spacing w:before="160"/>
+      </w:pPr>
+      <w:r>
+        <w:rPr>
+          <w:b/>
+        </w:rPr>
+        <w:t>26. [Q12] Are AI vendors, AI features in purchased software and foundation-model providers risk-assessed before use, with AI-specific contract clauses and ongoing monitoring?</w:t>
+      </w:r>
+    </w:p>
+    <w:p>
+      <w:pPr>
+        <w:keepNext/>
+      </w:pPr>
+      <w:r>
+        <w:rPr>
+          <w:i/>
+          <w:color w:val="6B6B6B"/>
+          <w:sz w:val="18"/>
+        </w:rPr>
+        <w:t>Examples of evidence: AI vendor due-diligence questionnaire, contract clauses (no training on your data, residency, incident notice, audit rights), vendor assurance (ISO/IEC 42001, SOC 2), review records.</w:t>
+      </w:r>
+    </w:p>
+    <w:p>
+      <w:pPr>
+        <w:keepNext/>
+        <w:spacing w:after="20"/>
+        <w:ind w:left="454"/>
+      </w:pPr>
+      <w:r>
+        <w:t>A. AI vendors and AI features in software are not assessed</w:t>
+      </w:r>
+    </w:p>
+    <w:p>
+      <w:pPr>
+        <w:keepNext/>
+        <w:spacing w:after="20"/>
+        <w:ind w:left="454"/>
+      </w:pPr>
+      <w:r>
+        <w:t>B. Standard IT procurement only; AI-specific risks not considered</w:t>
+      </w:r>
+    </w:p>
+    <w:p>
+      <w:pPr>
+        <w:keepNext/>
+        <w:spacing w:after="20"/>
+        <w:ind w:left="454"/>
+      </w:pPr>
+      <w:r>
+        <w:t>C. AI questions added to vendor due diligence for some purchases; contract terms vary</w:t>
+      </w:r>
+    </w:p>
+    <w:p>
+      <w:pPr>
+        <w:keepNext/>
+        <w:spacing w:after="20"/>
+        <w:ind w:left="454"/>
+      </w:pPr>
+      <w:r>
+        <w:t>D. Mandatory AI due diligence and standard AI contract clauses for all AI vendors; providers reviewed annually</w:t>
+      </w:r>
+    </w:p>
+    <w:p>
+      <w:pPr>
+        <w:keepNext w:val="0"/>
+        <w:spacing w:after="20"/>
+        <w:ind w:left="454"/>
+      </w:pPr>
+      <w:r>
+        <w:t>E. Continuous monitoring of AI vendors and model changes; AI bill of materials maintained; exit plans for critical providers</w:t>
+      </w:r>
+    </w:p>
+    <w:p>
+      <w:pPr>
+        <w:keepNext/>
+        <w:spacing w:before="160"/>
+      </w:pPr>
+      <w:r>
+        <w:rPr>
+          <w:b/>
+        </w:rPr>
+        <w:t>27. [Q13] Are AI systems protected with least-privilege access, secure development and testing (incl. red teaming for prompt injection), and runtime logging?</w:t>
+      </w:r>
+    </w:p>
+    <w:p>
+      <w:pPr>
+        <w:keepNext/>
+      </w:pPr>
+      <w:r>
+        <w:rPr>
+          <w:i/>
+          <w:color w:val="6B6B6B"/>
+          <w:sz w:val="18"/>
+        </w:rPr>
+        <w:t>Examples of evidence: AI threat models, access reviews (incl. agent identities), AI red-team reports, guardrail and sandbox configurations, audit logs. Detailed test: GT AI Security &amp; Agent Audit Checklist.</w:t>
+      </w:r>
+    </w:p>
+    <w:p>
+      <w:pPr>
+        <w:keepNext/>
+        <w:spacing w:after="20"/>
+        <w:ind w:left="454"/>
+      </w:pPr>
+      <w:r>
+        <w:t>A. AI systems are not specifically considered in security controls</w:t>
+      </w:r>
+    </w:p>
+    <w:p>
+      <w:pPr>
+        <w:keepNext/>
+        <w:spacing w:after="20"/>
+        <w:ind w:left="454"/>
+      </w:pPr>
+      <w:r>
+        <w:t>B. Standard IT security controls apply; no AI-specific threat assessment</w:t>
+      </w:r>
+    </w:p>
+    <w:p>
+      <w:pPr>
+        <w:keepNext/>
+        <w:spacing w:after="20"/>
+        <w:ind w:left="454"/>
+      </w:pPr>
+      <w:r>
+        <w:t>C. AI-specific threats (e.g., prompt injection, data leakage) assessed for some systems; access controls and logging in place</w:t>
+      </w:r>
+    </w:p>
+    <w:p>
+      <w:pPr>
+        <w:keepNext/>
+        <w:spacing w:after="20"/>
+        <w:ind w:left="454"/>
+      </w:pPr>
+      <w:r>
+        <w:t>D. Secure AI development lifecycle; least privilege for users, systems and agents; sandboxed tool execution; AI red teaming before release; runtime guardrails and audit logging</w:t>
+      </w:r>
+    </w:p>
+    <w:p>
+      <w:pPr>
+        <w:keepNext w:val="0"/>
+        <w:spacing w:after="20"/>
+        <w:ind w:left="454"/>
+      </w:pPr>
+      <w:r>
+        <w:t>E. Continuous adversarial testing, AI supply-chain assurance (model scanning, AI-BOM) and forensic-ready logging integrated with the SOC</w:t>
+      </w:r>
+    </w:p>
+    <w:p>
+      <w:pPr>
+        <w:keepNext/>
+        <w:spacing w:before="160"/>
+      </w:pPr>
+      <w:r>
+        <w:rPr>
+          <w:b/>
+        </w:rPr>
+        <w:t>28. [Q14] Is the organisation prepared for AI-enabled attacks such as deepfake impersonation, AI-crafted phishing and automated exploitation?</w:t>
+      </w:r>
+    </w:p>
+    <w:p>
+      <w:pPr>
+        <w:keepNext/>
+      </w:pPr>
+      <w:r>
+        <w:rPr>
+          <w:i/>
+          <w:color w:val="6B6B6B"/>
+          <w:sz w:val="18"/>
+        </w:rPr>
+        <w:t>Examples of evidence: AI threat intelligence, out-of-band verification procedures, deepfake simulations, SOC use cases, playbooks, patch metrics.</w:t>
+      </w:r>
+    </w:p>
+    <w:p>
+      <w:pPr>
+        <w:keepNext/>
+        <w:spacing w:after="20"/>
+        <w:ind w:left="454"/>
+      </w:pPr>
+      <w:r>
+        <w:t>A. AI-enabled threats not considered</w:t>
+      </w:r>
+    </w:p>
+    <w:p>
+      <w:pPr>
+        <w:keepNext/>
+        <w:spacing w:after="20"/>
+        <w:ind w:left="454"/>
+      </w:pPr>
+      <w:r>
+        <w:t>B. General awareness only; no specific controls</w:t>
+      </w:r>
+    </w:p>
+    <w:p>
+      <w:pPr>
+        <w:keepNext/>
+        <w:spacing w:after="20"/>
+        <w:ind w:left="454"/>
+      </w:pPr>
+      <w:r>
+        <w:t>C. Threat intelligence covers AI-enabled attacks; out-of-band verification for some high-risk requests</w:t>
+      </w:r>
+    </w:p>
+    <w:p>
+      <w:pPr>
+        <w:keepNext/>
+        <w:spacing w:after="20"/>
+        <w:ind w:left="454"/>
+      </w:pPr>
+      <w:r>
+        <w:t>D. Deepfake-resilient verification for payments and sensitive requests; behaviour-based detection; AI incident playbooks exercised</w:t>
+      </w:r>
+    </w:p>
+    <w:p>
+      <w:pPr>
+        <w:keepNext w:val="0"/>
+        <w:spacing w:after="20"/>
+        <w:ind w:left="454"/>
+      </w:pPr>
+      <w:r>
+        <w:t>E. Continuous exposure management and AI-specific red teaming; automated response at machine speed; critical vulnerabilities remediated in days</w:t>
+      </w:r>
+    </w:p>
+    <w:p>
+      <w:pPr>
+        <w:pStyle w:val="Heading2"/>
+      </w:pPr>
+      <w:r>
+        <w:t>Training &amp; Awareness</w:t>
+      </w:r>
+    </w:p>
+    <w:p>
+      <w:pPr>
+        <w:keepNext/>
+        <w:spacing w:before="160"/>
+      </w:pPr>
+      <w:r>
+        <w:rPr>
+          <w:b/>
+        </w:rPr>
+        <w:t>29. [Q15] Have staff received AI literacy training appropriate to their role, and are specialist AI, governance and security skills being developed?</w:t>
+      </w:r>
+    </w:p>
+    <w:p>
+      <w:pPr>
+        <w:keepNext/>
+      </w:pPr>
+      <w:r>
+        <w:rPr>
+          <w:i/>
+          <w:color w:val="6B6B6B"/>
+          <w:sz w:val="18"/>
+        </w:rPr>
+        <w:t>Examples of evidence: training curricula, completion records, role-based pathways, deepfake / phishing simulations, workforce plan.</w:t>
+      </w:r>
+    </w:p>
+    <w:p>
+      <w:pPr>
+        <w:keepNext/>
+        <w:spacing w:after="20"/>
+        <w:ind w:left="454"/>
+      </w:pPr>
+      <w:r>
+        <w:t>A. No AI training provided</w:t>
+      </w:r>
+    </w:p>
+    <w:p>
+      <w:pPr>
+        <w:keepNext/>
+        <w:spacing w:after="20"/>
+        <w:ind w:left="454"/>
+      </w:pPr>
+      <w:r>
+        <w:t>B. Ad hoc awareness sessions or self-learning only</w:t>
+      </w:r>
+    </w:p>
+    <w:p>
+      <w:pPr>
+        <w:keepNext/>
+        <w:spacing w:after="20"/>
+        <w:ind w:left="454"/>
+      </w:pPr>
+      <w:r>
+        <w:t>C. Baseline AI literacy training available to all staff; limited role-based training</w:t>
+      </w:r>
+    </w:p>
+    <w:p>
+      <w:pPr>
+        <w:keepNext/>
+        <w:spacing w:after="20"/>
+        <w:ind w:left="454"/>
+      </w:pPr>
+      <w:r>
+        <w:t>D. Mandatory AI literacy before tool access; role-based pathways for developers, oversight staff and leaders; scenario-based security awareness</w:t>
+      </w:r>
+    </w:p>
+    <w:p>
+      <w:pPr>
+        <w:keepNext w:val="0"/>
+        <w:spacing w:after="20"/>
+        <w:ind w:left="454"/>
+      </w:pPr>
+      <w:r>
+        <w:t>E. Competence measured and refreshed annually; workforce plan addresses future AI skills and job redesign; active AI champions network</w:t>
+      </w:r>
+    </w:p>
+    <w:p>
+      <w:pPr>
+        <w:pStyle w:val="Heading2"/>
+      </w:pPr>
+      <w:r>
         <w:t>Strategy &amp; Value</w:t>
       </w:r>
     </w:p>
@@ -962,7 +1811,7 @@
         <w:rPr>
           <w:b/>
         </w:rPr>
-        <w:t>19. [Q5] Is there executive ownership and an approved AI strategy that defines the ambition, priorities and where AI will (and will not) be used?</w:t>
+        <w:t>30. [Q16] Is there executive ownership and an approved AI strategy that defines the ambition, priorities and where AI will (and will not) be used?</w:t>
       </w:r>
     </w:p>
     <w:p>
@@ -1037,7 +1886,7 @@
         <w:rPr>
           <w:b/>
         </w:rPr>
-        <w:t>20. [Q6] How are AI use cases identified, prioritised, approved and measured for value?</w:t>
+        <w:t>31. [Q17] How are AI use cases identified, prioritised, approved and measured for value?</w:t>
       </w:r>
     </w:p>
     <w:p>
@@ -1108,7 +1957,7 @@
         <w:pStyle w:val="Heading2"/>
       </w:pPr>
       <w:r>
-        <w:t>Governance, Risk &amp; Compliance</w:t>
+        <w:t>Data &amp; Technology</w:t>
       </w:r>
     </w:p>
     <w:p>
@@ -1120,698 +1969,7 @@
         <w:rPr>
           <w:b/>
         </w:rPr>
-        <w:t>21. [Q7] Is there a defined AI governance structure - board / executive oversight, an AI committee with decision rights, named owners for every AI system and clear three-lines-of-defence responsibilities?</w:t>
-      </w:r>
-    </w:p>
-    <w:p>
-      <w:pPr>
-        <w:keepNext/>
-      </w:pPr>
-      <w:r>
-        <w:rPr>
-          <w:i/>
-          <w:color w:val="6B6B6B"/>
-          <w:sz w:val="18"/>
-        </w:rPr>
-        <w:t>Examples of evidence: board / ExCo terms of reference covering AI, AI committee charter, RACI, AI system owner register, internal-audit coverage.</w:t>
-      </w:r>
-    </w:p>
-    <w:p>
-      <w:pPr>
-        <w:keepNext/>
-        <w:spacing w:after="20"/>
-        <w:ind w:left="454"/>
-      </w:pPr>
-      <w:r>
-        <w:t>A. No defined AI governance; decisions are made ad hoc by individual teams</w:t>
-      </w:r>
-    </w:p>
-    <w:p>
-      <w:pPr>
-        <w:keepNext/>
-        <w:spacing w:after="20"/>
-        <w:ind w:left="454"/>
-      </w:pPr>
-      <w:r>
-        <w:t>B. Informal oversight by IT or a single function; roles not documented</w:t>
-      </w:r>
-    </w:p>
-    <w:p>
-      <w:pPr>
-        <w:keepNext/>
-        <w:spacing w:after="20"/>
-        <w:ind w:left="454"/>
-      </w:pPr>
-      <w:r>
-        <w:t>C. AI committee or sponsor defined on paper; roles and decision rights partly documented</w:t>
-      </w:r>
-    </w:p>
-    <w:p>
-      <w:pPr>
-        <w:keepNext/>
-        <w:spacing w:after="20"/>
-        <w:ind w:left="454"/>
-      </w:pPr>
-      <w:r>
-        <w:t>D. Board / ExCo oversight, AI committee with charter and decision rights, named system owners and a documented RACI across the three lines</w:t>
-      </w:r>
-    </w:p>
-    <w:p>
-      <w:pPr>
-        <w:keepNext w:val="0"/>
-        <w:spacing w:after="20"/>
-        <w:ind w:left="454"/>
-      </w:pPr>
-      <w:r>
-        <w:t>E. Governance operates effectively: regular board reporting, periodic effectiveness review and independent assurance by internal audit</w:t>
-      </w:r>
-    </w:p>
-    <w:p>
-      <w:pPr>
-        <w:keepNext/>
-        <w:spacing w:before="160"/>
-      </w:pPr>
-      <w:r>
-        <w:rPr>
-          <w:b/>
-        </w:rPr>
-        <w:t>22. [Q8] Do you have an approved AI (acceptable-use) policy and a process to identify and comply with applicable AI-related regulation (e.g., Bahrain PDPL, CBB rules, EU AI Act)?</w:t>
-      </w:r>
-    </w:p>
-    <w:p>
-      <w:pPr>
-        <w:keepNext/>
-      </w:pPr>
-      <w:r>
-        <w:rPr>
-          <w:i/>
-          <w:color w:val="6B6B6B"/>
-          <w:sz w:val="18"/>
-        </w:rPr>
-        <w:t>Examples of evidence: AI policy, approved-tools list, staff acknowledgements, obligations register, compliance reviews.</w:t>
-      </w:r>
-    </w:p>
-    <w:p>
-      <w:pPr>
-        <w:keepNext/>
-        <w:spacing w:after="20"/>
-        <w:ind w:left="454"/>
-      </w:pPr>
-      <w:r>
-        <w:t>A. No AI policy; applicable AI regulations have not been identified</w:t>
-      </w:r>
-    </w:p>
-    <w:p>
-      <w:pPr>
-        <w:keepNext/>
-        <w:spacing w:after="20"/>
-        <w:ind w:left="454"/>
-      </w:pPr>
-      <w:r>
-        <w:t>B. Informal guidance only (e.g., emails); obligations understood by a few individuals</w:t>
-      </w:r>
-    </w:p>
-    <w:p>
-      <w:pPr>
-        <w:keepNext/>
-        <w:spacing w:after="20"/>
-        <w:ind w:left="454"/>
-      </w:pPr>
-      <w:r>
-        <w:t>C. AI acceptable-use policy approved; regulatory obligations identified but not mapped to controls</w:t>
-      </w:r>
-    </w:p>
-    <w:p>
-      <w:pPr>
-        <w:keepNext/>
-        <w:spacing w:after="20"/>
-        <w:ind w:left="454"/>
-      </w:pPr>
-      <w:r>
-        <w:t>D. AI policy enforced with staff acknowledgement; obligations register maps regulations to controls and owners</w:t>
-      </w:r>
-    </w:p>
-    <w:p>
-      <w:pPr>
-        <w:keepNext w:val="0"/>
-        <w:spacing w:after="20"/>
-        <w:ind w:left="454"/>
-      </w:pPr>
-      <w:r>
-        <w:t>E. Policy and obligations register reviewed regularly with horizon scanning; compliance tested and audit-ready evidence maintained</w:t>
-      </w:r>
-    </w:p>
-    <w:p>
-      <w:pPr>
-        <w:keepNext/>
-        <w:spacing w:before="160"/>
-      </w:pPr>
-      <w:r>
-        <w:rPr>
-          <w:b/>
-        </w:rPr>
-        <w:t>23. [Q9] Is there a documented AI risk management framework - risk taxonomy, assessment method, scoring scales and treatment process - integrated with enterprise risk management?</w:t>
-      </w:r>
-    </w:p>
-    <w:p>
-      <w:pPr>
-        <w:keepNext/>
-      </w:pPr>
-      <w:r>
-        <w:rPr>
-          <w:i/>
-          <w:color w:val="6B6B6B"/>
-          <w:sz w:val="18"/>
-        </w:rPr>
-        <w:t>Examples of evidence: AI risk framework / methodology (e.g., aligned to ISO/IEC 23894 or NIST AI RMF), AI risk register, link to the enterprise risk register, completed assessments.</w:t>
-      </w:r>
-    </w:p>
-    <w:p>
-      <w:pPr>
-        <w:keepNext/>
-        <w:spacing w:after="20"/>
-        <w:ind w:left="454"/>
-      </w:pPr>
-      <w:r>
-        <w:t>A. AI risks are not identified or managed</w:t>
-      </w:r>
-    </w:p>
-    <w:p>
-      <w:pPr>
-        <w:keepNext/>
-        <w:spacing w:after="20"/>
-        <w:ind w:left="454"/>
-      </w:pPr>
-      <w:r>
-        <w:t>B. AI risks considered informally within general IT or project risk</w:t>
-      </w:r>
-    </w:p>
-    <w:p>
-      <w:pPr>
-        <w:keepNext/>
-        <w:spacing w:after="20"/>
-        <w:ind w:left="454"/>
-      </w:pPr>
-      <w:r>
-        <w:t>C. AI risk methodology drafted (taxonomy, scales) and applied to some AI initiatives</w:t>
-      </w:r>
-    </w:p>
-    <w:p>
-      <w:pPr>
-        <w:keepNext/>
-        <w:spacing w:after="20"/>
-        <w:ind w:left="454"/>
-      </w:pPr>
-      <w:r>
-        <w:t>D. Approved AI risk framework aligned to ISO/IEC 23894 / NIST AI RMF, applied to all AI use cases and integrated with the enterprise risk register</w:t>
-      </w:r>
-    </w:p>
-    <w:p>
-      <w:pPr>
-        <w:keepNext w:val="0"/>
-        <w:spacing w:after="20"/>
-        <w:ind w:left="454"/>
-      </w:pPr>
-      <w:r>
-        <w:t>E. Framework reviewed annually; AI risk aggregated across the portfolio and used in decisions; treatment effectiveness tested</w:t>
-      </w:r>
-    </w:p>
-    <w:p>
-      <w:pPr>
-        <w:keepNext/>
-        <w:spacing w:before="160"/>
-      </w:pPr>
-      <w:r>
-        <w:rPr>
-          <w:b/>
-        </w:rPr>
-        <w:t>24. [Q10] Has the board approved an AI risk appetite with measurable tolerances, and are key risk indicators (KRIs) monitored and reported with defined escalation?</w:t>
-      </w:r>
-    </w:p>
-    <w:p>
-      <w:pPr>
-        <w:keepNext/>
-      </w:pPr>
-      <w:r>
-        <w:rPr>
-          <w:i/>
-          <w:color w:val="6B6B6B"/>
-          <w:sz w:val="18"/>
-        </w:rPr>
-        <w:t>Examples of evidence: approved AI risk appetite statement, KRI library with thresholds, risk dashboards, escalation and breach records.</w:t>
-      </w:r>
-    </w:p>
-    <w:p>
-      <w:pPr>
-        <w:keepNext/>
-        <w:spacing w:after="20"/>
-        <w:ind w:left="454"/>
-      </w:pPr>
-      <w:r>
-        <w:t>A. No AI risk appetite or risk indicators</w:t>
-      </w:r>
-    </w:p>
-    <w:p>
-      <w:pPr>
-        <w:keepNext/>
-        <w:spacing w:after="20"/>
-        <w:ind w:left="454"/>
-      </w:pPr>
-      <w:r>
-        <w:t>B. Enterprise risk appetite exists but does not address AI</w:t>
-      </w:r>
-    </w:p>
-    <w:p>
-      <w:pPr>
-        <w:keepNext/>
-        <w:spacing w:after="20"/>
-        <w:ind w:left="454"/>
-      </w:pPr>
-      <w:r>
-        <w:t>C. AI risk appetite drafted; a few indicators tracked informally</w:t>
-      </w:r>
-    </w:p>
-    <w:p>
-      <w:pPr>
-        <w:keepNext/>
-        <w:spacing w:after="20"/>
-        <w:ind w:left="454"/>
-      </w:pPr>
-      <w:r>
-        <w:t>D. Board-approved AI risk appetite with tolerances; KRIs with thresholds monitored and reported at least quarterly</w:t>
-      </w:r>
-    </w:p>
-    <w:p>
-      <w:pPr>
-        <w:keepNext w:val="0"/>
-        <w:spacing w:after="20"/>
-        <w:ind w:left="454"/>
-      </w:pPr>
-      <w:r>
-        <w:t>E. KRIs automated with mandatory responses on breach; appetite reviewed annually and used to steer investment and approvals</w:t>
-      </w:r>
-    </w:p>
-    <w:p>
-      <w:pPr>
-        <w:keepNext/>
-        <w:spacing w:before="160"/>
-      </w:pPr>
-      <w:r>
-        <w:rPr>
-          <w:b/>
-        </w:rPr>
-        <w:t>25. [Q11] Do you maintain an inventory of AI systems with named owners, and assess AI risks and impacts (including third-party AI) before and after deployment?</w:t>
-      </w:r>
-    </w:p>
-    <w:p>
-      <w:pPr>
-        <w:keepNext/>
-      </w:pPr>
-      <w:r>
-        <w:rPr>
-          <w:i/>
-          <w:color w:val="6B6B6B"/>
-          <w:sz w:val="18"/>
-        </w:rPr>
-        <w:t>Examples of evidence: AI register, risk-tiering records, impact assessments, vendor AI due diligence, re-assessment records.</w:t>
-      </w:r>
-    </w:p>
-    <w:p>
-      <w:pPr>
-        <w:keepNext/>
-        <w:spacing w:after="20"/>
-        <w:ind w:left="454"/>
-      </w:pPr>
-      <w:r>
-        <w:t>A. No inventory; AI risks are not assessed</w:t>
-      </w:r>
-    </w:p>
-    <w:p>
-      <w:pPr>
-        <w:keepNext/>
-        <w:spacing w:after="20"/>
-        <w:ind w:left="454"/>
-      </w:pPr>
-      <w:r>
-        <w:t>B. Partial list of AI tools; risks assessed occasionally through general IT or vendor processes</w:t>
-      </w:r>
-    </w:p>
-    <w:p>
-      <w:pPr>
-        <w:keepNext/>
-        <w:spacing w:after="20"/>
-        <w:ind w:left="454"/>
-      </w:pPr>
-      <w:r>
-        <w:t>C. AI register with owners; risk assessments performed for some AI systems using a documented method</w:t>
-      </w:r>
-    </w:p>
-    <w:p>
-      <w:pPr>
-        <w:keepNext/>
-        <w:spacing w:after="20"/>
-        <w:ind w:left="454"/>
-      </w:pPr>
-      <w:r>
-        <w:t>D. Complete AI register; all AI use cases risk-tiered and assessed (incl. third-party AI) with approvals proportionate to risk</w:t>
-      </w:r>
-    </w:p>
-    <w:p>
-      <w:pPr>
-        <w:keepNext w:val="0"/>
-        <w:spacing w:after="20"/>
-        <w:ind w:left="454"/>
-      </w:pPr>
-      <w:r>
-        <w:t>E. Register reconciled quarterly; impact assessments (ISO/IEC 42005 / FRIA) for high-risk uses; re-assessment on change with KRIs monitored</w:t>
-      </w:r>
-    </w:p>
-    <w:p>
-      <w:pPr>
-        <w:keepNext/>
-        <w:spacing w:before="160"/>
-      </w:pPr>
-      <w:r>
-        <w:rPr>
-          <w:b/>
-        </w:rPr>
-        <w:t>26. [Q12] Are AI vendors, AI features in purchased software and foundation-model providers risk-assessed before use, with AI-specific contract clauses and ongoing monitoring?</w:t>
-      </w:r>
-    </w:p>
-    <w:p>
-      <w:pPr>
-        <w:keepNext/>
-      </w:pPr>
-      <w:r>
-        <w:rPr>
-          <w:i/>
-          <w:color w:val="6B6B6B"/>
-          <w:sz w:val="18"/>
-        </w:rPr>
-        <w:t>Examples of evidence: AI vendor due-diligence questionnaire, contract clauses (no training on your data, residency, incident notice, audit rights), vendor assurance (ISO/IEC 42001, SOC 2), review records.</w:t>
-      </w:r>
-    </w:p>
-    <w:p>
-      <w:pPr>
-        <w:keepNext/>
-        <w:spacing w:after="20"/>
-        <w:ind w:left="454"/>
-      </w:pPr>
-      <w:r>
-        <w:t>A. AI vendors and AI features in software are not assessed</w:t>
-      </w:r>
-    </w:p>
-    <w:p>
-      <w:pPr>
-        <w:keepNext/>
-        <w:spacing w:after="20"/>
-        <w:ind w:left="454"/>
-      </w:pPr>
-      <w:r>
-        <w:t>B. Standard IT procurement only; AI-specific risks not considered</w:t>
-      </w:r>
-    </w:p>
-    <w:p>
-      <w:pPr>
-        <w:keepNext/>
-        <w:spacing w:after="20"/>
-        <w:ind w:left="454"/>
-      </w:pPr>
-      <w:r>
-        <w:t>C. AI questions added to vendor due diligence for some purchases; contract terms vary</w:t>
-      </w:r>
-    </w:p>
-    <w:p>
-      <w:pPr>
-        <w:keepNext/>
-        <w:spacing w:after="20"/>
-        <w:ind w:left="454"/>
-      </w:pPr>
-      <w:r>
-        <w:t>D. Mandatory AI due diligence and standard AI contract clauses for all AI vendors; providers reviewed annually</w:t>
-      </w:r>
-    </w:p>
-    <w:p>
-      <w:pPr>
-        <w:keepNext w:val="0"/>
-        <w:spacing w:after="20"/>
-        <w:ind w:left="454"/>
-      </w:pPr>
-      <w:r>
-        <w:t>E. Continuous monitoring of AI vendors and model changes; AI bill of materials maintained; exit plans for critical providers</w:t>
-      </w:r>
-    </w:p>
-    <w:p>
-      <w:pPr>
-        <w:keepNext/>
-        <w:spacing w:before="160"/>
-      </w:pPr>
-      <w:r>
-        <w:rPr>
-          <w:b/>
-        </w:rPr>
-        <w:t>27. [Q13] Are there practical guardrails for fairness, transparency and human oversight, overseen by an AI committee or centre of excellence?</w:t>
-      </w:r>
-    </w:p>
-    <w:p>
-      <w:pPr>
-        <w:keepNext/>
-      </w:pPr>
-      <w:r>
-        <w:rPr>
-          <w:i/>
-          <w:color w:val="6B6B6B"/>
-          <w:sz w:val="18"/>
-        </w:rPr>
-        <w:t>Examples of evidence: committee / CoE charter, guardrail standards, human-in-charge procedures, bias tests, AI disclosures, appeal routes.</w:t>
-      </w:r>
-    </w:p>
-    <w:p>
-      <w:pPr>
-        <w:keepNext/>
-        <w:spacing w:after="20"/>
-        <w:ind w:left="454"/>
-      </w:pPr>
-      <w:r>
-        <w:t>A. No responsible-AI guardrails or oversight body</w:t>
-      </w:r>
-    </w:p>
-    <w:p>
-      <w:pPr>
-        <w:keepNext/>
-        <w:spacing w:after="20"/>
-        <w:ind w:left="454"/>
-      </w:pPr>
-      <w:r>
-        <w:t>B. High-level ethical principles published but not operationalised</w:t>
-      </w:r>
-    </w:p>
-    <w:p>
-      <w:pPr>
-        <w:keepNext/>
-        <w:spacing w:after="20"/>
-        <w:ind w:left="454"/>
-      </w:pPr>
-      <w:r>
-        <w:t>C. AI committee / CoE established; guardrails defined for some areas (e.g., human review of outputs)</w:t>
-      </w:r>
-    </w:p>
-    <w:p>
-      <w:pPr>
-        <w:keepNext/>
-        <w:spacing w:after="20"/>
-        <w:ind w:left="454"/>
-      </w:pPr>
-      <w:r>
-        <w:t>D. Guardrails for fairness, transparency, disclosure and human-in-charge controls applied to all relevant AI; committee approves high-risk uses</w:t>
-      </w:r>
-    </w:p>
-    <w:p>
-      <w:pPr>
-        <w:keepNext w:val="0"/>
-        <w:spacing w:after="20"/>
-        <w:ind w:left="454"/>
-      </w:pPr>
-      <w:r>
-        <w:t>E. Guardrails tested (bias testing, oversight effectiveness); contestability routes for affected persons; lessons fed back into standards</w:t>
-      </w:r>
-    </w:p>
-    <w:p>
-      <w:pPr>
-        <w:keepNext/>
-        <w:spacing w:before="160"/>
-      </w:pPr>
-      <w:r>
-        <w:rPr>
-          <w:b/>
-        </w:rPr>
-        <w:t>28. [Q14] Are AI incidents detected, managed and reported, and is AI governance subject to internal audit or independent assurance?</w:t>
-      </w:r>
-    </w:p>
-    <w:p>
-      <w:pPr>
-        <w:keepNext/>
-      </w:pPr>
-      <w:r>
-        <w:rPr>
-          <w:i/>
-          <w:color w:val="6B6B6B"/>
-          <w:sz w:val="18"/>
-        </w:rPr>
-        <w:t>Examples of evidence: AI incident categories, notification criteria, incident logs, internal-audit reports, vendor assurance, certification status.</w:t>
-      </w:r>
-    </w:p>
-    <w:p>
-      <w:pPr>
-        <w:keepNext/>
-        <w:spacing w:after="20"/>
-        <w:ind w:left="454"/>
-      </w:pPr>
-      <w:r>
-        <w:t>A. No AI incident process or assurance</w:t>
-      </w:r>
-    </w:p>
-    <w:p>
-      <w:pPr>
-        <w:keepNext/>
-        <w:spacing w:after="20"/>
-        <w:ind w:left="454"/>
-      </w:pPr>
-      <w:r>
-        <w:t>B. AI issues handled through general IT incident processes; no AI-specific assurance</w:t>
-      </w:r>
-    </w:p>
-    <w:p>
-      <w:pPr>
-        <w:keepNext/>
-        <w:spacing w:after="20"/>
-        <w:ind w:left="454"/>
-      </w:pPr>
-      <w:r>
-        <w:t>C. AI incident categories and escalation defined; ad hoc reviews of AI controls</w:t>
-      </w:r>
-    </w:p>
-    <w:p>
-      <w:pPr>
-        <w:keepNext/>
-        <w:spacing w:after="20"/>
-        <w:ind w:left="454"/>
-      </w:pPr>
-      <w:r>
-        <w:t>D. AI incident management with regulatory notification criteria; periodic internal audit of AI governance; assurance obtained from AI vendors</w:t>
-      </w:r>
-    </w:p>
-    <w:p>
-      <w:pPr>
-        <w:keepNext w:val="0"/>
-        <w:spacing w:after="20"/>
-        <w:ind w:left="454"/>
-      </w:pPr>
-      <w:r>
-        <w:t>E. Post-incident learning drives improvement; AI management system certified or certification-ready (ISO/IEC 42001); assurance reported to the board</w:t>
-      </w:r>
-    </w:p>
-    <w:p>
-      <w:pPr>
-        <w:pStyle w:val="Heading2"/>
-      </w:pPr>
-      <w:r>
-        <w:t>People &amp; Skills</w:t>
-      </w:r>
-    </w:p>
-    <w:p>
-      <w:pPr>
-        <w:keepNext/>
-        <w:spacing w:before="160"/>
-      </w:pPr>
-      <w:r>
-        <w:rPr>
-          <w:b/>
-        </w:rPr>
-        <w:t>29. [Q15] Have staff received AI literacy training appropriate to their role, and are specialist AI, governance and security skills being developed?</w:t>
-      </w:r>
-    </w:p>
-    <w:p>
-      <w:pPr>
-        <w:keepNext/>
-      </w:pPr>
-      <w:r>
-        <w:rPr>
-          <w:i/>
-          <w:color w:val="6B6B6B"/>
-          <w:sz w:val="18"/>
-        </w:rPr>
-        <w:t>Examples of evidence: training curricula, completion records, role-based pathways, deepfake / phishing simulations, workforce plan.</w:t>
-      </w:r>
-    </w:p>
-    <w:p>
-      <w:pPr>
-        <w:keepNext/>
-        <w:spacing w:after="20"/>
-        <w:ind w:left="454"/>
-      </w:pPr>
-      <w:r>
-        <w:t>A. No AI training provided</w:t>
-      </w:r>
-    </w:p>
-    <w:p>
-      <w:pPr>
-        <w:keepNext/>
-        <w:spacing w:after="20"/>
-        <w:ind w:left="454"/>
-      </w:pPr>
-      <w:r>
-        <w:t>B. Ad hoc awareness sessions or self-learning only</w:t>
-      </w:r>
-    </w:p>
-    <w:p>
-      <w:pPr>
-        <w:keepNext/>
-        <w:spacing w:after="20"/>
-        <w:ind w:left="454"/>
-      </w:pPr>
-      <w:r>
-        <w:t>C. Baseline AI literacy training available to all staff; limited role-based training</w:t>
-      </w:r>
-    </w:p>
-    <w:p>
-      <w:pPr>
-        <w:keepNext/>
-        <w:spacing w:after="20"/>
-        <w:ind w:left="454"/>
-      </w:pPr>
-      <w:r>
-        <w:t>D. Mandatory AI literacy before tool access; role-based pathways for developers, oversight staff and leaders; scenario-based security awareness</w:t>
-      </w:r>
-    </w:p>
-    <w:p>
-      <w:pPr>
-        <w:keepNext w:val="0"/>
-        <w:spacing w:after="20"/>
-        <w:ind w:left="454"/>
-      </w:pPr>
-      <w:r>
-        <w:t>E. Competence measured and refreshed annually; workforce plan addresses future AI skills and job redesign; active AI champions network</w:t>
-      </w:r>
-    </w:p>
-    <w:p>
-      <w:pPr>
-        <w:pStyle w:val="Heading2"/>
-      </w:pPr>
-      <w:r>
-        <w:t>Data &amp; Technology</w:t>
-      </w:r>
-    </w:p>
-    <w:p>
-      <w:pPr>
-        <w:keepNext/>
-        <w:spacing w:before="160"/>
-      </w:pPr>
-      <w:r>
-        <w:rPr>
-          <w:b/>
-        </w:rPr>
-        <w:t>30. [Q16] Is data used by AI classified, quality-assured, traceable and protected in line with privacy requirements (e.g., Bahrain PDPL)?</w:t>
+        <w:t>32. [Q18] Is data used by AI classified, quality-assured, traceable and protected in line with privacy requirements (e.g., Bahrain PDPL)?</w:t>
       </w:r>
     </w:p>
     <w:p>
@@ -1886,7 +2044,7 @@
         <w:rPr>
           <w:b/>
         </w:rPr>
-        <w:t>31. [Q17] Is there a common AI reference architecture with standard integration patterns, and are AI systems monitored for performance, drift and cost?</w:t>
+        <w:t>33. [Q19] Is there a common AI reference architecture with standard integration patterns, and are AI systems monitored for performance, drift and cost?</w:t>
       </w:r>
     </w:p>
     <w:p>
@@ -1961,7 +2119,7 @@
         <w:rPr>
           <w:b/>
         </w:rPr>
-        <w:t>32. [Q18] Are material AI / ML models independently validated before use and periodically, with a model inventory, performance thresholds and documented limitations?</w:t>
+        <w:t>34. [Q20] Are material AI / ML models independently validated before use and periodically, with a model inventory, performance thresholds and documented limitations?</w:t>
       </w:r>
     </w:p>
     <w:p>
@@ -2025,164 +2183,6 @@
       </w:pPr>
       <w:r>
         <w:t>E. Model risk management aligned to SR 11-7 / PRA SS1/23 principles, with continuous monitoring and findings tracked to closure</w:t>
-      </w:r>
-    </w:p>
-    <w:p>
-      <w:pPr>
-        <w:pStyle w:val="Heading2"/>
-      </w:pPr>
-      <w:r>
-        <w:t>AI Security &amp; Threat Risk</w:t>
-      </w:r>
-    </w:p>
-    <w:p>
-      <w:pPr>
-        <w:keepNext/>
-        <w:spacing w:before="160"/>
-      </w:pPr>
-      <w:r>
-        <w:rPr>
-          <w:b/>
-        </w:rPr>
-        <w:t>33. [Q19] Are AI systems protected with least-privilege access, secure development and testing (incl. red teaming for prompt injection), and runtime logging?</w:t>
-      </w:r>
-    </w:p>
-    <w:p>
-      <w:pPr>
-        <w:keepNext/>
-      </w:pPr>
-      <w:r>
-        <w:rPr>
-          <w:i/>
-          <w:color w:val="6B6B6B"/>
-          <w:sz w:val="18"/>
-        </w:rPr>
-        <w:t>Examples of evidence: AI threat models, access reviews (incl. agent identities), AI red-team reports, guardrail and sandbox configurations, audit logs. Detailed test: GT AI Security &amp; Agent Audit Checklist.</w:t>
-      </w:r>
-    </w:p>
-    <w:p>
-      <w:pPr>
-        <w:keepNext/>
-        <w:spacing w:after="20"/>
-        <w:ind w:left="454"/>
-      </w:pPr>
-      <w:r>
-        <w:t>A. AI systems are not specifically considered in security controls</w:t>
-      </w:r>
-    </w:p>
-    <w:p>
-      <w:pPr>
-        <w:keepNext/>
-        <w:spacing w:after="20"/>
-        <w:ind w:left="454"/>
-      </w:pPr>
-      <w:r>
-        <w:t>B. Standard IT security controls apply; no AI-specific threat assessment</w:t>
-      </w:r>
-    </w:p>
-    <w:p>
-      <w:pPr>
-        <w:keepNext/>
-        <w:spacing w:after="20"/>
-        <w:ind w:left="454"/>
-      </w:pPr>
-      <w:r>
-        <w:t>C. AI-specific threats (e.g., prompt injection, data leakage) assessed for some systems; access controls and logging in place</w:t>
-      </w:r>
-    </w:p>
-    <w:p>
-      <w:pPr>
-        <w:keepNext/>
-        <w:spacing w:after="20"/>
-        <w:ind w:left="454"/>
-      </w:pPr>
-      <w:r>
-        <w:t>D. Secure AI development lifecycle; least privilege for users, systems and agents; sandboxed tool execution; AI red teaming before release; runtime guardrails and audit logging</w:t>
-      </w:r>
-    </w:p>
-    <w:p>
-      <w:pPr>
-        <w:keepNext w:val="0"/>
-        <w:spacing w:after="20"/>
-        <w:ind w:left="454"/>
-      </w:pPr>
-      <w:r>
-        <w:t>E. Continuous adversarial testing, AI supply-chain assurance (model scanning, AI-BOM) and forensic-ready logging integrated with the SOC</w:t>
-      </w:r>
-    </w:p>
-    <w:p>
-      <w:pPr>
-        <w:keepNext/>
-        <w:spacing w:before="160"/>
-      </w:pPr>
-      <w:r>
-        <w:rPr>
-          <w:b/>
-        </w:rPr>
-        <w:t>34. [Q20] Is the organisation prepared for AI-enabled attacks such as deepfake impersonation, AI-crafted phishing and automated exploitation?</w:t>
-      </w:r>
-    </w:p>
-    <w:p>
-      <w:pPr>
-        <w:keepNext/>
-      </w:pPr>
-      <w:r>
-        <w:rPr>
-          <w:i/>
-          <w:color w:val="6B6B6B"/>
-          <w:sz w:val="18"/>
-        </w:rPr>
-        <w:t>Examples of evidence: AI threat intelligence, out-of-band verification procedures, deepfake simulations, SOC use cases, playbooks, patch metrics.</w:t>
-      </w:r>
-    </w:p>
-    <w:p>
-      <w:pPr>
-        <w:keepNext/>
-        <w:spacing w:after="20"/>
-        <w:ind w:left="454"/>
-      </w:pPr>
-      <w:r>
-        <w:t>A. AI-enabled threats not considered</w:t>
-      </w:r>
-    </w:p>
-    <w:p>
-      <w:pPr>
-        <w:keepNext/>
-        <w:spacing w:after="20"/>
-        <w:ind w:left="454"/>
-      </w:pPr>
-      <w:r>
-        <w:t>B. General awareness only; no specific controls</w:t>
-      </w:r>
-    </w:p>
-    <w:p>
-      <w:pPr>
-        <w:keepNext/>
-        <w:spacing w:after="20"/>
-        <w:ind w:left="454"/>
-      </w:pPr>
-      <w:r>
-        <w:t>C. Threat intelligence covers AI-enabled attacks; out-of-band verification for some high-risk requests</w:t>
-      </w:r>
-    </w:p>
-    <w:p>
-      <w:pPr>
-        <w:keepNext/>
-        <w:spacing w:after="20"/>
-        <w:ind w:left="454"/>
-      </w:pPr>
-      <w:r>
-        <w:t>D. Deepfake-resilient verification for payments and sensitive requests; behaviour-based detection; AI incident playbooks exercised</w:t>
-      </w:r>
-    </w:p>
-    <w:p>
-      <w:pPr>
-        <w:keepNext w:val="0"/>
-        <w:spacing w:after="20"/>
-        <w:ind w:left="454"/>
-      </w:pPr>
-      <w:r>
-        <w:t>E. Continuous exposure management and AI-specific red teaming; automated response at machine speed; critical vulnerabilities remediated in days</w:t>
       </w:r>
     </w:p>
     <w:p>

</xml_diff>